<commit_message>
feat: add §5.1 frontier mismatch subsection (intensive vs extensive frontiers; space & religious war); +2 endnotes, renumbered
Co-Authored-By: Tatsuki Onishi <bougtoir@gmail.com>
</commit_message>
<xml_diff>
--- a/calculus_of_lives/output/manuscript_en.docx
+++ b/calculus_of_lives/output/manuscript_en.docx
@@ -591,6 +591,61 @@
     </w:p>
     <w:p>
       <w:pPr>
+        <w:spacing w:before="160" w:after="80"/>
+      </w:pPr>
+      <w:r>
+        <w:rPr>
+          <w:b/>
+          <w:i/>
+          <w:sz w:val="24"/>
+        </w:rPr>
+        <w:t>5.1 The Frontier Mismatch: Intensive and Extensive Frontiers, and a Third Incommensurability</w:t>
+      </w:r>
+    </w:p>
+    <w:p>
+      <w:pPr>
+        <w:ind w:firstLine="576"/>
+      </w:pPr>
+      <w:r>
+        <w:t>A single mechanism can be extracted from this diagnosis, and it bears directly on the contemporary fear of civilizational war. A tradition of the infinite external frontier depends, for its peace, on the frontier remaining open: Frederick Jackson Turner argued that the vitality and cohesion of an expansionist society are sustained by the availability of unclaimed land, so that the closing of the frontier throws the expansionist energy back upon the society itself.</w:t>
+      </w:r>
+      <w:r>
+        <w:rPr>
+          <w:vertAlign w:val="superscript"/>
+        </w:rPr>
+        <w:t>23</w:t>
+      </w:r>
+      <w:r>
+        <w:t xml:space="preserve"> One might infer that once the known and unclaimed regions are exhausted, collision becomes inevitable, and that a new frontier—outer space, say—might therefore drain the pressure and pacify the wars of the expansionist creeds. I think this inference is half right, and that seeing why sharpens the whole account.</w:t>
+      </w:r>
+    </w:p>
+    <w:p>
+      <w:pPr>
+        <w:ind w:firstLine="576"/>
+      </w:pPr>
+      <w:r>
+        <w:t>The frontier that such traditions crave is not one thing but two, and the two have different topologies. The material frontier is extensive: empty land, unused energy, a matter of volume that more space can always enlarge. The spiritual frontier is intensive: it is directed at particular souls, at the neighbor who believes otherwise, at territory that is not empty but wrongly occupied—a matter of density, not of volume. The two cannot be exchanged for each other. An intensive demand cannot be discharged into an extensive supply, because the object the intensive drive seeks (this heretic, converted or erased) is not the object the extensive frontier offers (that empty expanse, settled). This is a third incommensurability, and it is the same blade that has cut twice already, now recurring at the civilizational scale: as lives are not convertible into a common unit (Section 2) and dignity is not convertible into price (Section 3), so the spiritual and material frontiers are not convertible into each other. Conflict springs less from the exhaustion of frontier than from the mismatch between the two frontiers—from the attempt, and the failure, to vent an intensive pressure through an extensive outlet.</w:t>
+      </w:r>
+    </w:p>
+    <w:p>
+      <w:pPr>
+        <w:ind w:firstLine="576"/>
+      </w:pPr>
+      <w:r>
+        <w:t>The historical record fits the mismatch better than the exhaustion story. The Age of Discovery flung open a vast extensive frontier, yet Europe’s most terrible religious war, the Thirty Years’ War, raged in the same epoch: the new material space did nothing to relieve the intensive pressure of confessional truth-claims turned against the neighbor. Conversely, where the intensive demand is low—where a plurality of truths has been inwardly accepted—religious war is rare even under material scarcity. What varies is not the quantity of available frontier but the phase-match between the two kinds. The implication for the space age is sobering. Space enlarges only the extensive frontier; it leaves the phase gap untouched, and the very triumph of expansion may amplify the intensive drive to carry one’s own truth to the stars—a Jevons rebound of the spirit. The one pacifying path space might open is not the frontier as outlet but the frontier as mirror: the ‘overview effect,’ the relativizing of tribal and confessional boundaries reported by those who have seen the earth whole and undivided from outside.</w:t>
+      </w:r>
+      <w:r>
+        <w:rPr>
+          <w:vertAlign w:val="superscript"/>
+        </w:rPr>
+        <w:t>24</w:t>
+      </w:r>
+      <w:r>
+        <w:t xml:space="preserve"> But that works by lowering the intensive demand itself—by shrinking the claim rather than enlarging the supply—and so belongs, once again, to the demand-reducing hand to which I now turn.</w:t>
+      </w:r>
+    </w:p>
+    <w:p>
+      <w:pPr>
         <w:spacing w:before="240" w:after="120"/>
       </w:pPr>
       <w:r>
@@ -672,7 +727,7 @@
         <w:rPr>
           <w:vertAlign w:val="superscript"/>
         </w:rPr>
-        <w:t>23</w:t>
+        <w:t>25</w:t>
       </w:r>
       <w:r>
         <w:t xml:space="preserve"> The rebound generalizes: supply-side progress, pursued alone, tends to inflate the very demand it was meant to satisfy, so that the frontier recedes as fast as one advances on it. Technology unaccompanied by any discipline of wanting does not close the gap between demand and supply; it runs in place, and licenses the endless expansion that keeps the taking calculus in business.</w:t>
@@ -689,7 +744,7 @@
         <w:rPr>
           <w:vertAlign w:val="superscript"/>
         </w:rPr>
-        <w:t>24</w:t>
+        <w:t>26</w:t>
       </w:r>
       <w:r>
         <w:t xml:space="preserve"> What I propose adds to Schumacher's economics the ethical and political content of the preceding sections: demand-reduction matters not only because it eases the material scramble but because it is the practical form of stepping down from the sovereign's chair. To reduce one's own demand is to withdraw, by just that much, from the position of the taker—to make oneself the first bearer of cost rather than the optimizer who displaces cost onto others. The discipline of wanting less is thus continuous with the giving calculus at the level of the person: the individual who lowers his own claims on a finite world is doing, in small, what a peaceable civilization must do in large. It is here that private asceticism and the avoidance of world war turn out to be the same movement viewed at different scales, and here too that the tradition of ahimsa, which refuses to license impure means by pure ends, meets the argument of Section 4.</w:t>
@@ -698,7 +753,7 @@
         <w:rPr>
           <w:vertAlign w:val="superscript"/>
         </w:rPr>
-        <w:t>25</w:t>
+        <w:t>27</w:t>
       </w:r>
       <w:r/>
     </w:p>
@@ -713,7 +768,7 @@
         <w:rPr>
           <w:vertAlign w:val="superscript"/>
         </w:rPr>
-        <w:t>26</w:t>
+        <w:t>28</w:t>
       </w:r>
       <w:r>
         <w:t xml:space="preserve"> the two-handed task is what such an ethics looks like when it is turned specifically against the recurrence of total war.</w:t>
@@ -1147,7 +1202,7 @@
         <w:rPr>
           <w:sz w:val="21"/>
         </w:rPr>
-        <w:t>William Stanley Jevons, The Coal Question, 2nd ed. (London: Macmillan, 1866), chap. 7. For the contemporary literature, see Blake Alcott, “Jevons’ Paradox,” Ecological Economics 54, no. 1 (2005): 9–21.</w:t>
+        <w:t>Frederick Jackson Turner, “The Significance of the Frontier in American History” (1893), in The Frontier in American History (New York: Henry Holt, 1920), 1–38.</w:t>
       </w:r>
     </w:p>
     <w:p>
@@ -1164,7 +1219,7 @@
         <w:rPr>
           <w:sz w:val="21"/>
         </w:rPr>
-        <w:t>E. F. Schumacher, “Buddhist Economics,” in Small Is Beautiful: Economics as if People Mattered (London: Blond &amp; Briggs, 1973), 50–58.</w:t>
+        <w:t>On the ‘overview effect,’ see Frank White, The Overview Effect: Space Exploration and Human Evolution, 3rd ed. (Reston, VA: AIAA, 2014); and Carl Sagan, Pale Blue Dot: A Vision of the Human Future in Space (New York: Random House, 1994), 3–9.</w:t>
       </w:r>
     </w:p>
     <w:p>
@@ -1181,6 +1236,40 @@
         <w:rPr>
           <w:sz w:val="21"/>
         </w:rPr>
+        <w:t>William Stanley Jevons, The Coal Question, 2nd ed. (London: Macmillan, 1866), chap. 7. For the contemporary literature, see Blake Alcott, “Jevons’ Paradox,” Ecological Economics 54, no. 1 (2005): 9–21.</w:t>
+      </w:r>
+    </w:p>
+    <w:p>
+      <w:pPr>
+        <w:spacing w:line="360" w:lineRule="auto" w:after="40"/>
+      </w:pPr>
+      <w:r>
+        <w:rPr>
+          <w:b/>
+        </w:rPr>
+        <w:t xml:space="preserve">26. </w:t>
+      </w:r>
+      <w:r>
+        <w:rPr>
+          <w:sz w:val="21"/>
+        </w:rPr>
+        <w:t>E. F. Schumacher, “Buddhist Economics,” in Small Is Beautiful: Economics as if People Mattered (London: Blond &amp; Briggs, 1973), 50–58.</w:t>
+      </w:r>
+    </w:p>
+    <w:p>
+      <w:pPr>
+        <w:spacing w:line="360" w:lineRule="auto" w:after="40"/>
+      </w:pPr>
+      <w:r>
+        <w:rPr>
+          <w:b/>
+        </w:rPr>
+        <w:t xml:space="preserve">27. </w:t>
+      </w:r>
+      <w:r>
+        <w:rPr>
+          <w:sz w:val="21"/>
+        </w:rPr>
         <w:t>M. K. Gandhi, Non-Violent Resistance (Satyagraha) (New York: Schocken, 1961); on craving (taṇhā) as the root to be extinguished, Walpola Rahula, What the Buddha Taught, 2nd ed. (New York: Grove Press, 1974), 29–44.</w:t>
       </w:r>
     </w:p>
@@ -1192,7 +1281,7 @@
         <w:rPr>
           <w:b/>
         </w:rPr>
-        <w:t xml:space="preserve">26. </w:t>
+        <w:t xml:space="preserve">28. </w:t>
       </w:r>
       <w:r>
         <w:rPr>

</xml_diff>

<commit_message>
feat(calculus): add E&IA Essay version and expand manuscript to Feature length
- Add create_essay_en.py -> essay_en.docx (~2,700 words, 8 notes, no
  figures) for the E&IA non-refereed Essays category
- Expand manuscript_en to ~7,100 words (Feature, 7-8k): objection/reply
  paragraphs in secs 2-6, deterrence-as-biopolitics, supreme-emergency and
  conscription replies, new sec 7 'Objections and Replies'; conclusion -> sec 8
- Add 5 endnotes (Williams, Nussbaum, Walzer supreme emergency, Schelling, Nye); now 33
- Refactor endnote engine to auto-renumber by first appearance (Vancouver)
- Update README to reflect three deliverables

Co-Authored-By: Tatsuki Onishi <bougtoir@gmail.com>
</commit_message>
<xml_diff>
--- a/calculus_of_lives/output/manuscript_en.docx
+++ b/calculus_of_lives/output/manuscript_en.docx
@@ -161,6 +161,14 @@
     </w:p>
     <w:p>
       <w:pPr>
+        <w:ind w:firstLine="576"/>
+      </w:pPr>
+      <w:r>
+        <w:t>A word on method and scope. This is a work of normative argument, not of historical revision; I take no stand on the disputed facts of 1945 beyond granting the defender his most favorable version, precisely so that the outer-layer question can be isolated from the empirical quarrel that usually swallows it. Nor do I claim that the argument settles what any particular government should do in a given crisis; its ambition is prior to that—to recover a question that policy has learned not to ask, and to show that the recovery has consequences all the way down, from the metaethics of value to the design of security institutions. The choice of Hiroshima as the case is deliberate. It is the moment at which the arithmetic of lives was performed most explicitly, at the largest scale, and with the clearest public conscience; if the outer-layer question has force anywhere, it has force here, and what is learned here transfers to the quieter weighings—of sanctions, of deterrence, of the acceptable civilian toll—that fill the ordinary conduct of states. The bomb is not the disease but its purest symptom, and I use it as a lens rather than a target.</w:t>
+      </w:r>
+    </w:p>
+    <w:p>
+      <w:pPr>
         <w:spacing w:before="240" w:after="120"/>
       </w:pPr>
       <w:r>
@@ -288,6 +296,32 @@
     </w:p>
     <w:p>
       <w:pPr>
+        <w:ind w:firstLine="576"/>
+      </w:pPr>
+      <w:r>
+        <w:t>It will be objected that we compare lives constantly and unavoidably: the battlefield medic triages, the health system prices a year of life, the regulator fixes a value on statistical mortality. If incommensurability were true, the objection runs, all such practice would be impossible, and since it is not impossible, incommensurability must be false. The reply turns on a distinction the objection blurs. To choose under incommensurability is not the same as to choose by computing a common sum. The medic who saves the salvageable is not asserting that the salvageable life contains more units of a homogeneous good than the life he lets go; he is acting well under a tragic constraint without claiming that arithmetic vindicates him. What incommensurability denies is not that we can choose, nor even that some choices are better than others, but that the choice is licensed by, and answerable to, a cardinal quantity of aggregated value.</w:t>
+      </w:r>
+      <w:r>
+        <w:rPr>
+          <w:vertAlign w:val="superscript"/>
+        </w:rPr>
+        <w:t>10</w:t>
+      </w:r>
+      <w:r>
+        <w:t xml:space="preserve"> At most there is rough comparability—enough to act, never enough to certify a killing as the balance struck by a ledger.</w:t>
+      </w:r>
+      <w:r>
+        <w:rPr>
+          <w:vertAlign w:val="superscript"/>
+        </w:rPr>
+        <w:t>9</w:t>
+      </w:r>
+      <w:r>
+        <w:t xml:space="preserve"> The atomic justification does not merely choose under tragedy; it claims the authority of a sum. That claim, and not the possibility of hard choice, is what the argument refuses.</w:t>
+      </w:r>
+    </w:p>
+    <w:p>
+      <w:pPr>
         <w:spacing w:before="240" w:after="120"/>
       </w:pPr>
       <w:r>
@@ -361,6 +395,32 @@
         <w:ind w:firstLine="576"/>
       </w:pPr>
       <w:r>
+        <w:t>A hard-nosed reader will protest that this makes morality turn on a feeling. If two acts have the same outcome, what can it matter whether the agent mourned? The objection assumes that the remainder is a mere sentiment decorating an act whose moral character is already fixed by its consequences. But the remainder is not decoration; it is evidence, and sometimes constitutive. Bernard Williams called the residue that a decent agent feels after a forced wrong agent-regret, and argued that its absence marks not toughness but a failure to register a moral reality: that a genuine claim was overridden, not annulled.</w:t>
+      </w:r>
+      <w:r>
+        <w:rPr>
+          <w:vertAlign w:val="superscript"/>
+        </w:rPr>
+        <w:t>14</w:t>
+      </w:r>
+      <w:r>
+        <w:t xml:space="preserve"> Martha Nussbaum, reading Greek tragedy, showed that the mature response to an irresolvable conflict of obligations is not to declare the defeated obligation cancelled by the victorious one but to remain answerable to both, and so to owe something to the party one had to fail.</w:t>
+      </w:r>
+      <w:r>
+        <w:rPr>
+          <w:vertAlign w:val="superscript"/>
+        </w:rPr>
+        <w:t>15</w:t>
+      </w:r>
+      <w:r>
+        <w:t xml:space="preserve"> The remainder tracks this fact. And because it does, it is not inert: the agent who feels it acts differently next time—builds the institutions, the rules of engagement, the habits of restraint that a society without the remainder never troubles to build. Attitude, in this sense, is not private sentiment but a disposition with public and cumulative effects. It is the difference between a polity that treats each recourse to lethal force as a wound to be minimized and one that treats it as a cost to be optimized.</w:t>
+      </w:r>
+    </w:p>
+    <w:p>
+      <w:pPr>
+        <w:ind w:firstLine="576"/>
+      </w:pPr>
+      <w:r>
         <w:t>I concede without embarrassment that the giving calculus still weighs, and so is not innocent of the tragic structure of finite life. To choose whom to feed with a finite harvest is still to prefer some to others. But the difference in attitude is not a psychological gloss on an otherwise identical act; it changes what the act is. A society that has lost the distinction—that hears no difference between taking and giving so long as the totals match—has lost the thing that separates provision from predation.</w:t>
       </w:r>
     </w:p>
@@ -387,7 +447,7 @@
         <w:rPr>
           <w:vertAlign w:val="superscript"/>
         </w:rPr>
-        <w:t>14</w:t>
+        <w:t>16</w:t>
       </w:r>
       <w:r>
         <w:t xml:space="preserve"> Michael Walzer grounds the immunity in the idea that one becomes a legitimate target only by posing a threat, by entering the zone of danger as a participant—which is why, on his account, even the munitions worker is liable while at the factory and making weapons, yet regains his immunity at home, where he is a person and not a threat.</w:t>
@@ -396,7 +456,7 @@
         <w:rPr>
           <w:vertAlign w:val="superscript"/>
         </w:rPr>
-        <w:t>15</w:t>
+        <w:t>17</w:t>
       </w:r>
       <w:r/>
     </w:p>
@@ -413,13 +473,21 @@
         <w:ind w:firstLine="576"/>
       </w:pPr>
       <w:r>
+        <w:t>The consent basis invites an immediate objection: most soldiers through history have been conscripts, pressed into service by states they did not choose, and some—child soldiers above all—cannot consent in any meaningful sense. If liability depended on literal autobiographical consent, the account would exempt most combatants and collapse. So I do not rest it there. Consent is the clearest case of a more general relation: standing within the role of a bearer of arms, and thereby presenting oneself as a threat and entering the zone of danger. The role is normative, not merely biographical; the conscript, however he arrived at it, occupies it and poses the threat that grounds his liability, whereas the civilian occupies no such role and poses no such threat. What the vocation account adds to the bare fact of threat is an explanation of why the soldier's death can be more than sheer wrong done to him—why there is honor available in it—and that explanation is fullest where the role is freely embraced and thinnest where it is coerced. This is why our moral unease rightly returns, rather than disappears, in the case of the child soldier: we sense that someone has been placed in the zone of danger who never could have shouldered its meaning, and the wrong belongs to those who put him there. The account thus tracks our judgments across the range of cases better than the crude function test, which would make liability a simple matter of causal contribution to the war effort.</w:t>
+      </w:r>
+    </w:p>
+    <w:p>
+      <w:pPr>
+        <w:ind w:firstLine="576"/>
+      </w:pPr>
+      <w:r>
         <w:t>This yields a verdict on the bomb that requires no delicate balancing. The atomic attacks did not target the soldier at his post or even the worker at his factory; they took the city itself—the civilian as such, the pure patient—as the direct object, indeed as the intended instrument, the terror of whose death was the very mechanism by which surrender was to be produced. Under the doctrine of double effect, which permits foreseen but unintended civilian deaths incident to a legitimate military aim but forbids their use as a means, this is not a hard case.</w:t>
       </w:r>
       <w:r>
         <w:rPr>
           <w:vertAlign w:val="superscript"/>
         </w:rPr>
-        <w:t>16</w:t>
+        <w:t>18</w:t>
       </w:r>
       <w:r>
         <w:t xml:space="preserve"> The killing of the innocent was not a side effect of striking something else; it was the instrument. Elizabeth Anscombe saw this with unmatched clarity when she opposed the award of an honorary degree to Truman, naming him a murderer on the ground that the deliberate killing of the innocent as a means to victory is murder whatever its consequences—and refusing the consequentialist frame that would make the question turn on a tally.</w:t>
@@ -428,7 +496,7 @@
         <w:rPr>
           <w:vertAlign w:val="superscript"/>
         </w:rPr>
-        <w:t>17</w:t>
+        <w:t>19</w:t>
       </w:r>
       <w:r>
         <w:t xml:space="preserve"> Rawls, half a century later, reached the same judgment.</w:t>
@@ -437,7 +505,7 @@
         <w:rPr>
           <w:vertAlign w:val="superscript"/>
         </w:rPr>
-        <w:t>18</w:t>
+        <w:t>20</w:t>
       </w:r>
       <w:r/>
     </w:p>
@@ -447,6 +515,23 @@
       </w:pPr>
       <w:r>
         <w:t>I add only this. That such a case is treated as genuinely debatable—that reasonable people are expected to argue about whether the incineration of noncombatant cities might be licensed by its results—is itself a symptom. It indicates a public culture in which the ideas of vocation and professional sacrifice have thinned to the point where the distinction between the one who has accepted danger and the one who has not no longer registers, and every death is flattened into an interchangeable unit of disvalue awaiting its place in a sum. The debatability of the bomb is a measure of how far the taking calculus has colonized the moral imagination.</w:t>
+      </w:r>
+    </w:p>
+    <w:p>
+      <w:pPr>
+        <w:ind w:firstLine="576"/>
+      </w:pPr>
+      <w:r>
+        <w:t>The most serious challenge to this verdict is Walzer's own doctrine of supreme emergency. Faced with an imminent and unprecedented threat—Nazism triumphant, say—Walzer allows that a political community may deliberately violate noncombatant immunity, as Britain arguably did in the early area bombing of German cities, because the very existence of a moral world is at stake.</w:t>
+      </w:r>
+      <w:r>
+        <w:rPr>
+          <w:vertAlign w:val="superscript"/>
+        </w:rPr>
+        <w:t>21</w:t>
+      </w:r>
+      <w:r>
+        <w:t xml:space="preserve"> If the prohibition can be overridden in extremis, the objection runs, then it is after all a weight in a balance, and we are back inside the calculus. I resist this at both levels. On the outer view, the prohibition on using the innocent as a mere means is not a heavy weight but a constraint of a different type—not something that great enough stakes outweigh, but something that stakes do not reach; supreme emergency is precisely the taking calculus readmitted under the duress that makes it most tempting and least examined. But even those unwilling to go so far should notice the second point: the atomic case does not satisfy Walzer's own conditions. The United States in 1945 faced neither imminent defeat nor an existential threat to its moral community; it faced the prospect of a costlier victory it was already assured of winning. Whatever one thinks of supreme emergency in the abstract, the bombing was not an instance of it. The exception, even granted, does not cover the case.</w:t>
       </w:r>
     </w:p>
     <w:p>
@@ -472,7 +557,7 @@
         <w:rPr>
           <w:vertAlign w:val="superscript"/>
         </w:rPr>
-        <w:t>19</w:t>
+        <w:t>22</w:t>
       </w:r>
       <w:r>
         <w:t xml:space="preserve"> Michel Foucault describes the modern transformation of this power into biopolitics: a power that takes the life of populations as its object and administers it at the aggregate—fostering some lives, disallowing others to the point of death—through the apparatus of statistics, public health, and, at the limit, the calculated sacrifices of war.</w:t>
@@ -481,7 +566,7 @@
         <w:rPr>
           <w:vertAlign w:val="superscript"/>
         </w:rPr>
-        <w:t>20</w:t>
+        <w:t>23</w:t>
       </w:r>
       <w:r>
         <w:t xml:space="preserve"> The strategic bombing of cities is biopolitics in its most naked form: whole populations entered as quantities into an equation of national survival.</w:t>
@@ -493,6 +578,23 @@
       </w:pPr>
       <w:r>
         <w:t>What these analyses share with my argument is the recognition that the gravest violence begins not with a wrong answer to the question of who may weigh, but with the question's disappearance—with the emergence of a standpoint from which weighing lives appears as an administrative task rather than a usurpation. To recover the outer-layer question is thus a political act: it reintroduces, against the sovereign's silence, the doubt about whether anyone is entitled to occupy the accountant's chair.</w:t>
+      </w:r>
+    </w:p>
+    <w:p>
+      <w:pPr>
+        <w:ind w:firstLine="576"/>
+      </w:pPr>
+      <w:r>
+        <w:t>Nuclear deterrence is this biopolitics raised to a principle and made permanent. Under mutual assured destruction, entire civilian populations are held, continuously and by design, as hostages to the conduct of their governments; the credibility of the threat depends on a standing readiness to incinerate them. Thomas Schelling described this with cold precision as the diplomacy of violence, in which the capacity to inflict pain on the innocent is not an unfortunate by-product of war but its very instrument of persuasion.</w:t>
+      </w:r>
+      <w:r>
+        <w:rPr>
+          <w:vertAlign w:val="superscript"/>
+        </w:rPr>
+        <w:t>24</w:t>
+      </w:r>
+      <w:r>
+        <w:t xml:space="preserve"> Here the taking calculus is not merely committed in a moment of decision but institutionalized as a posture maintained around the clock, for decades, as the ordinary condition of international order. The outer-layer question, asked of deterrence, is radical precisely because deterrence has normalized what it interrogates: it treats the reduction of populations to hostages—to summable quantities of potential disvalue—as the settled grammar of security. That this arrangement is widely regarded as prudent, even stabilizing, is the clearest measure of how completely the sovereign's chair has been occupied without the question of entitlement being raised.</w:t>
       </w:r>
     </w:p>
     <w:p>
@@ -514,7 +616,7 @@
         <w:rPr>
           <w:vertAlign w:val="superscript"/>
         </w:rPr>
-        <w:t>21</w:t>
+        <w:t>25</w:t>
       </w:r>
       <w:r>
         <w:t xml:space="preserve"> A tradition that finds the divine distributed through an already-full world—pantheist, animist, immanent—has, by contrast, no external frontier to conquer and inclines toward harmony and restraint; early Buddhism makes the reduction of demand into an explicit soteriology, treating craving itself as the thing to be extinguished.</w:t>
@@ -531,10 +633,18 @@
         <w:rPr>
           <w:vertAlign w:val="superscript"/>
         </w:rPr>
-        <w:t>22</w:t>
+        <w:t>26</w:t>
       </w:r>
       <w:r>
         <w:t xml:space="preserve"> Conversely, polytheisms have been engines of conquest: Rome absorbed the gods of the peoples it subdued, and some agrarian cults sustained their fertility by extracting sacrificial victims from without. The lesson is that “supply-increasing versus demand-reducing” and “expansion versus contraction” are two independent axes, not one, and the religions distribute themselves across all four quadrants. What the map preserves from the naive typology is only this: the theology of an infinite external frontier and the ethic of unlimited supply are natural allies, and both stand at the maximal distance from the outer-layer question. Where the world is a frontier to be taken, the peoples on it are variables to be optimized. This is the metaphysical home of the taking calculus.</w:t>
+      </w:r>
+    </w:p>
+    <w:p>
+      <w:pPr>
+        <w:ind w:firstLine="576"/>
+      </w:pPr>
+      <w:r>
+        <w:t>I should be explicit about the status of these claims, since a typology that sorts religions risks caricature. I am not ranking traditions by moral worth, nor predicting the behavior of their adherents, who overwhelmingly live at peace with their neighbors. The claim is about the structural tendencies of doctrines under pressure—about the directions in which a metaphysic inclines a civilization when scarcity forces the question of provision—not about the character of believers. And the two-axis map is built precisely to defeat the caricature it might seem to invite: because supply-orientation and expansion are independent of each other, the framework predicts and accommodates the counterexamples rather than being embarrassed by them. Ascetic Protestantism sits in the demand-reducing column and yet, by Weber's dialectic, drove supply-expansion; imperial Rome sits among the polytheisms and yet conquered without limit. These are not anomalies to be explained away but data the model is designed to hold. What survives the qualifications is modest and, I think, secure: a metaphysic of the infinite external frontier lowers the threshold at which a civilization will reach for the taking calculus, and nothing in the typology licenses the inference from a people's creed to its guilt.</w:t>
       </w:r>
     </w:p>
     <w:p>
@@ -613,7 +723,7 @@
         <w:rPr>
           <w:vertAlign w:val="superscript"/>
         </w:rPr>
-        <w:t>23</w:t>
+        <w:t>27</w:t>
       </w:r>
       <w:r>
         <w:t xml:space="preserve"> One might infer that once the known and unclaimed regions are exhausted, collision becomes inevitable, and that a new frontier—outer space, say—might therefore drain the pressure and pacify the wars of the expansionist creeds. I think this inference is half right, and that seeing why sharpens the whole account.</w:t>
@@ -638,7 +748,7 @@
         <w:rPr>
           <w:vertAlign w:val="superscript"/>
         </w:rPr>
-        <w:t>24</w:t>
+        <w:t>28</w:t>
       </w:r>
       <w:r>
         <w:t xml:space="preserve"> But that works by lowering the intensive demand itself—by shrinking the claim rather than enlarging the supply—and so belongs, once again, to the demand-reducing hand to which I now turn.</w:t>
@@ -727,7 +837,7 @@
         <w:rPr>
           <w:vertAlign w:val="superscript"/>
         </w:rPr>
-        <w:t>25</w:t>
+        <w:t>29</w:t>
       </w:r>
       <w:r>
         <w:t xml:space="preserve"> The rebound generalizes: supply-side progress, pursued alone, tends to inflate the very demand it was meant to satisfy, so that the frontier recedes as fast as one advances on it. Technology unaccompanied by any discipline of wanting does not close the gap between demand and supply; it runs in place, and licenses the endless expansion that keeps the taking calculus in business.</w:t>
@@ -744,7 +854,7 @@
         <w:rPr>
           <w:vertAlign w:val="superscript"/>
         </w:rPr>
-        <w:t>26</w:t>
+        <w:t>30</w:t>
       </w:r>
       <w:r>
         <w:t xml:space="preserve"> What I propose adds to Schumacher's economics the ethical and political content of the preceding sections: demand-reduction matters not only because it eases the material scramble but because it is the practical form of stepping down from the sovereign's chair. To reduce one's own demand is to withdraw, by just that much, from the position of the taker—to make oneself the first bearer of cost rather than the optimizer who displaces cost onto others. The discipline of wanting less is thus continuous with the giving calculus at the level of the person: the individual who lowers his own claims on a finite world is doing, in small, what a peaceable civilization must do in large. It is here that private asceticism and the avoidance of world war turn out to be the same movement viewed at different scales, and here too that the tradition of ahimsa, which refuses to license impure means by pure ends, meets the argument of Section 4.</w:t>
@@ -753,7 +863,7 @@
         <w:rPr>
           <w:vertAlign w:val="superscript"/>
         </w:rPr>
-        <w:t>27</w:t>
+        <w:t>31</w:t>
       </w:r>
       <w:r/>
     </w:p>
@@ -768,10 +878,27 @@
         <w:rPr>
           <w:vertAlign w:val="superscript"/>
         </w:rPr>
-        <w:t>28</w:t>
+        <w:t>32</w:t>
       </w:r>
       <w:r>
         <w:t xml:space="preserve"> the two-handed task is what such an ethics looks like when it is turned specifically against the recurrence of total war.</w:t>
+      </w:r>
+    </w:p>
+    <w:p>
+      <w:pPr>
+        <w:ind w:firstLine="576"/>
+      </w:pPr>
+      <w:r>
+        <w:t>The realist will answer that this is a luxury of the secure. A civilization that unilaterally reduces its wants, he says, merely clears the field for the unrestrained, who will expand into the room it vacates; demand-reduction is a recipe for conquest by the greedy. The objection would be decisive against a doctrine of disarmament, but that is not the doctrine. What is to be reduced is demand—the appetite that drives a polity to resolve scarcity by taking from others—not the capacity to defend what one has. The two-handed task keeps the defensive hand; Section 4's ethic of the professional who accepts danger on others' behalf is exactly the honorable form that a contractive, defensive civilization's security takes. Indeed the argument cuts the other way for the exposed. A small state on a dangerous border cannot make itself safe by out-expanding a larger neighbor; its security, if it has any, lies in becoming hard to digest and cheap to leave alone—in defensive resilience joined to a politics that gives its neighbors no frontier to covet. For such a state, restraint of demand is not utopian sentiment but the most realistic security posture available. Joseph Nye argued that a defensible nuclear ethics must weave together consequences, rights, and intentions rather than collapsing into any one of them;</w:t>
+      </w:r>
+      <w:r>
+        <w:rPr>
+          <w:vertAlign w:val="superscript"/>
+        </w:rPr>
+        <w:t>33</w:t>
+      </w:r>
+      <w:r>
+        <w:t xml:space="preserve"> the account offered here specifies which thread is non-negotiable—the refusal to make the innocent a mere instrument—and which civilizational disposition makes honoring it sustainable.</w:t>
       </w:r>
     </w:p>
     <w:p>
@@ -783,7 +910,43 @@
           <w:b/>
           <w:sz w:val="26"/>
         </w:rPr>
-        <w:t>7. Conclusion</w:t>
+        <w:t>7. Objections and Replies</w:t>
+      </w:r>
+    </w:p>
+    <w:p>
+      <w:pPr>
+        <w:ind w:firstLine="576"/>
+      </w:pPr>
+      <w:r>
+        <w:t>Three further objections deserve a direct answer. The first is that the position is quietist: that in the face of atrocities demanding action, an ethic of wanting less and holding the scale reluctantly does nothing for the victims. But the argument is not a private spirituality of withdrawal. Its institutional content is considerable: it underwrites the laws of armed conflict and their prohibition on targeting civilians, the protection of the noncombatant as a right rather than a courtesy, and a security policy that measures itself by the wounds it refuses to inflict. To reduce demand at the civilizational scale is a program of political economy, not a counsel of retreat. Quietism would be the refusal to hold the scale at all; what is proposed is to hold it differently, and to build the institutions that a giving posture requires.</w:t>
+      </w:r>
+    </w:p>
+    <w:p>
+      <w:pPr>
+        <w:ind w:firstLine="576"/>
+      </w:pPr>
+      <w:r>
+        <w:t>The second objection is that incommensurability, if taken seriously, paralyzes policy: governments must compare and aggregate, and a doctrine that forbids it forbids governing. The reply completes the one begun in Section 2. Incommensurability does not forbid choice; it forbids a particular self-description of choice—the claim that a killing has been vindicated by a computed surplus of value. Sound institutions already reflect this. The lexical priority of certain rights over aggregate welfare, the side-constraints that no cost-benefit total may breach, the categorical prohibitions of the laws of war: these are the giving calculus written into public structure, mechanisms by which a polity binds itself in advance not to treat certain persons as summable. Far from paralyzing policy, the view recommends a familiar and workable architecture, and explains why its constraints are not mere prudence but principle.</w:t>
+      </w:r>
+    </w:p>
+    <w:p>
+      <w:pPr>
+        <w:ind w:firstLine="576"/>
+      </w:pPr>
+      <w:r>
+        <w:t>The third objection is that the distinction between taking and giving is unverifiable, a matter of inner attitude to which we have no access, and so useless for judgment. But the distinction is not locked inside the agent's breast. Its three marks are public. Whether a polity leaves a moral remainder shows in how it memorializes its dead and its enemy's, in whether it holds inquiries or averts its eyes; whether it directs the tie-breaker against itself shows in whether it accepts risk to its own forces to spare noncombatants, as the law of proportionality demands; whether it regards the unchosen as claimants shows in reparation, apology, and the revision of doctrine. Attitude leaves tracks. We read it in individuals every day, and we can read it in institutions by the same signs, writ large.</w:t>
+      </w:r>
+    </w:p>
+    <w:p>
+      <w:pPr>
+        <w:spacing w:before="240" w:after="120"/>
+      </w:pPr>
+      <w:r>
+        <w:rPr>
+          <w:b/>
+          <w:sz w:val="26"/>
+        </w:rPr>
+        <w:t>8. Conclusion</w:t>
       </w:r>
     </w:p>
     <w:p>
@@ -792,6 +955,14 @@
       </w:pPr>
       <w:r>
         <w:t>The question of whether the atomic bombings were necessary is the wrong question, or rather a question on the wrong layer. Answered on its own terms, in the affirmative or the negative, it leaves the graver matter untouched: whether human beings are entitled to weigh and trade the lives of others at all. I have argued that the weighing the justification claims to perform is not merely impermissible but, given the incommensurability of lives, unintelligible as arithmetic; that because finitude nonetheless forces us to choose, what distinguishes provision from predation is not the outcome of a weighing but its attitude—the taking calculus that prices the person against the giving calculus that keeps faith with a dignity it cannot perfectly honor; that the scope of any defensible weighing is constrained by the difference between those who have taken danger into a vocation and those who remain pure patients of it; and that the drift of whole civilizations toward the sovereign's chair, from which lives appear as summable quantities, is bound up with a choice between increasing supply and reducing demand.</w:t>
+      </w:r>
+    </w:p>
+    <w:p>
+      <w:pPr>
+        <w:ind w:firstLine="576"/>
+      </w:pPr>
+      <w:r>
+        <w:t>These threads are one argument. The incommensurability that unmasks the calculus, the attitude that survives its collapse, the vocation that bounds its reach, the frontier that mismatches and so ignites, the two hands that might yet prevent—each is a face of a single refusal: the refusal to occupy the accountant's chair as though it were ours by right. The unity matters, because the danger is unified. A civilization does not arrive at the incineration of cities by a single wicked decision but by a long habituation, in which the person becomes a quantity, the quantity becomes summable, and the summing becomes governance. To interrupt that habituation at any one of its stages is to weaken it at all of them. That is why an argument pitched at the level of metaphysics and attitude is not a retreat from politics but its most durable form: institutions decay, treaties lapse, deterrents are outbuilt, but a people that has learned to flinch at the sovereign's chair carries the prohibition in a place no adversary can disarm.</w:t>
       </w:r>
     </w:p>
     <w:p>
@@ -1049,7 +1220,7 @@
         <w:rPr>
           <w:sz w:val="21"/>
         </w:rPr>
-        <w:t>The principle of distinction is codified in Protocol I Additional to the Geneva Conventions (1977), arts. 48, 51. For its moral foundations, see Michael Walzer, Just and Unjust Wars: A Moral Argument with Historical Illustrations, 5th ed. (New York: Basic Books, 2015), chap. 9.</w:t>
+        <w:t>Bernard Williams, “Moral Luck,” in Moral Luck: Philosophical Papers 1973–1980 (Cambridge: Cambridge University Press, 1981), 20–39, on agent-regret.</w:t>
       </w:r>
     </w:p>
     <w:p>
@@ -1066,7 +1237,7 @@
         <w:rPr>
           <w:sz w:val="21"/>
         </w:rPr>
-        <w:t>Walzer, Just and Unjust Wars, 145–146 (on the munitions worker).</w:t>
+        <w:t>Martha C. Nussbaum, The Fragility of Goodness: Luck and Ethics in Greek Tragedy and Philosophy, rev. ed. (Cambridge: Cambridge University Press, 2001), esp. chaps. 2–3.</w:t>
       </w:r>
     </w:p>
     <w:p>
@@ -1083,7 +1254,7 @@
         <w:rPr>
           <w:sz w:val="21"/>
         </w:rPr>
-        <w:t>The doctrine descends from Thomas Aquinas, Summa Theologiae II-II, q. 64, a. 7; for its modern statement see Philippa Foot, “The Problem of Abortion and the Doctrine of the Double Effect,” Oxford Review 5 (1967): 5–15.</w:t>
+        <w:t>The principle of distinction is codified in Protocol I Additional to the Geneva Conventions (1977), arts. 48, 51. For its moral foundations, see Michael Walzer, Just and Unjust Wars: A Moral Argument with Historical Illustrations, 5th ed. (New York: Basic Books, 2015), chap. 9.</w:t>
       </w:r>
     </w:p>
     <w:p>
@@ -1100,7 +1271,7 @@
         <w:rPr>
           <w:sz w:val="21"/>
         </w:rPr>
-        <w:t>G. E. M. Anscombe, “Mr Truman’s Degree” (1957), reprinted in her Ethics, Religion and Politics: Collected Philosophical Papers, vol. 3 (Oxford: Blackwell, 1981), 62–71.</w:t>
+        <w:t>Walzer, Just and Unjust Wars, 145–146 (on the munitions worker).</w:t>
       </w:r>
     </w:p>
     <w:p>
@@ -1117,7 +1288,7 @@
         <w:rPr>
           <w:sz w:val="21"/>
         </w:rPr>
-        <w:t>John Rawls, “Fifty Years after Hiroshima” (1995), in Collected Papers, ed. Samuel Freeman (Cambridge, MA: Harvard University Press, 1999), 565–572.</w:t>
+        <w:t>The doctrine descends from Thomas Aquinas, Summa Theologiae II-II, q. 64, a. 7; for its modern statement see Philippa Foot, “The Problem of Abortion and the Doctrine of the Double Effect,” Oxford Review 5 (1967): 5–15.</w:t>
       </w:r>
     </w:p>
     <w:p>
@@ -1134,7 +1305,7 @@
         <w:rPr>
           <w:sz w:val="21"/>
         </w:rPr>
-        <w:t>Giorgio Agamben, Homo Sacer: Sovereign Power and Bare Life, trans. Daniel Heller-Roazen (Stanford: Stanford University Press, 1998), 71–86.</w:t>
+        <w:t>G. E. M. Anscombe, “Mr Truman’s Degree” (1957), reprinted in her Ethics, Religion and Politics: Collected Philosophical Papers, vol. 3 (Oxford: Blackwell, 1981), 62–71.</w:t>
       </w:r>
     </w:p>
     <w:p>
@@ -1151,7 +1322,7 @@
         <w:rPr>
           <w:sz w:val="21"/>
         </w:rPr>
-        <w:t>Michel Foucault, “Society Must Be Defended”: Lectures at the Collège de France, 1975–76, trans. David Macey (New York: Picador, 2003), 239–264; and The History of Sexuality, vol. 1, trans. Robert Hurley (New York: Pantheon, 1978), 135–145.</w:t>
+        <w:t>John Rawls, “Fifty Years after Hiroshima” (1995), in Collected Papers, ed. Samuel Freeman (Cambridge, MA: Harvard University Press, 1999), 565–572.</w:t>
       </w:r>
     </w:p>
     <w:p>
@@ -1168,7 +1339,7 @@
         <w:rPr>
           <w:sz w:val="21"/>
         </w:rPr>
-        <w:t>Lynn White Jr., “The Historical Roots of Our Ecologic Crisis,” Science 155, no. 3767 (1967): 1203–1207.</w:t>
+        <w:t>Michael Walzer, Just and Unjust Wars, 5th ed. (New York: Basic Books, 2015), chap. 16 (“Supreme Emergency”); for criticism, see Brian Orend, The Morality of War, 2nd ed. (Peterborough: Broadview, 2013), chap. 5.</w:t>
       </w:r>
     </w:p>
     <w:p>
@@ -1185,7 +1356,7 @@
         <w:rPr>
           <w:sz w:val="21"/>
         </w:rPr>
-        <w:t>Max Weber, The Protestant Ethic and the Spirit of Capitalism (1905), trans. Talcott Parsons (London: Routledge, 1992), esp. chap. 5.</w:t>
+        <w:t>Giorgio Agamben, Homo Sacer: Sovereign Power and Bare Life, trans. Daniel Heller-Roazen (Stanford: Stanford University Press, 1998), 71–86.</w:t>
       </w:r>
     </w:p>
     <w:p>
@@ -1202,7 +1373,7 @@
         <w:rPr>
           <w:sz w:val="21"/>
         </w:rPr>
-        <w:t>Frederick Jackson Turner, “The Significance of the Frontier in American History” (1893), in The Frontier in American History (New York: Henry Holt, 1920), 1–38.</w:t>
+        <w:t>Michel Foucault, “Society Must Be Defended”: Lectures at the Collège de France, 1975–76, trans. David Macey (New York: Picador, 2003), 239–264; and The History of Sexuality, vol. 1, trans. Robert Hurley (New York: Pantheon, 1978), 135–145.</w:t>
       </w:r>
     </w:p>
     <w:p>
@@ -1219,7 +1390,7 @@
         <w:rPr>
           <w:sz w:val="21"/>
         </w:rPr>
-        <w:t>On the ‘overview effect,’ see Frank White, The Overview Effect: Space Exploration and Human Evolution, 3rd ed. (Reston, VA: AIAA, 2014); and Carl Sagan, Pale Blue Dot: A Vision of the Human Future in Space (New York: Random House, 1994), 3–9.</w:t>
+        <w:t>Thomas C. Schelling, Arms and Influence (New Haven: Yale University Press, 1966), chap. 1 (“The Diplomacy of Violence”).</w:t>
       </w:r>
     </w:p>
     <w:p>
@@ -1236,7 +1407,7 @@
         <w:rPr>
           <w:sz w:val="21"/>
         </w:rPr>
-        <w:t>William Stanley Jevons, The Coal Question, 2nd ed. (London: Macmillan, 1866), chap. 7. For the contemporary literature, see Blake Alcott, “Jevons’ Paradox,” Ecological Economics 54, no. 1 (2005): 9–21.</w:t>
+        <w:t>Lynn White Jr., “The Historical Roots of Our Ecologic Crisis,” Science 155, no. 3767 (1967): 1203–1207.</w:t>
       </w:r>
     </w:p>
     <w:p>
@@ -1253,7 +1424,7 @@
         <w:rPr>
           <w:sz w:val="21"/>
         </w:rPr>
-        <w:t>E. F. Schumacher, “Buddhist Economics,” in Small Is Beautiful: Economics as if People Mattered (London: Blond &amp; Briggs, 1973), 50–58.</w:t>
+        <w:t>Max Weber, The Protestant Ethic and the Spirit of Capitalism (1905), trans. Talcott Parsons (London: Routledge, 1992), esp. chap. 5.</w:t>
       </w:r>
     </w:p>
     <w:p>
@@ -1270,7 +1441,7 @@
         <w:rPr>
           <w:sz w:val="21"/>
         </w:rPr>
-        <w:t>M. K. Gandhi, Non-Violent Resistance (Satyagraha) (New York: Schocken, 1961); on craving (taṇhā) as the root to be extinguished, Walpola Rahula, What the Buddha Taught, 2nd ed. (New York: Grove Press, 1974), 29–44.</w:t>
+        <w:t>Frederick Jackson Turner, “The Significance of the Frontier in American History” (1893), in The Frontier in American History (New York: Henry Holt, 1920), 1–38.</w:t>
       </w:r>
     </w:p>
     <w:p>
@@ -1287,7 +1458,92 @@
         <w:rPr>
           <w:sz w:val="21"/>
         </w:rPr>
+        <w:t>On the ‘overview effect,’ see Frank White, The Overview Effect: Space Exploration and Human Evolution, 3rd ed. (Reston, VA: AIAA, 2014); and Carl Sagan, Pale Blue Dot: A Vision of the Human Future in Space (New York: Random House, 1994), 3–9.</w:t>
+      </w:r>
+    </w:p>
+    <w:p>
+      <w:pPr>
+        <w:spacing w:line="360" w:lineRule="auto" w:after="40"/>
+      </w:pPr>
+      <w:r>
+        <w:rPr>
+          <w:b/>
+        </w:rPr>
+        <w:t xml:space="preserve">29. </w:t>
+      </w:r>
+      <w:r>
+        <w:rPr>
+          <w:sz w:val="21"/>
+        </w:rPr>
+        <w:t>William Stanley Jevons, The Coal Question, 2nd ed. (London: Macmillan, 1866), chap. 7. For the contemporary literature, see Blake Alcott, “Jevons’ Paradox,” Ecological Economics 54, no. 1 (2005): 9–21.</w:t>
+      </w:r>
+    </w:p>
+    <w:p>
+      <w:pPr>
+        <w:spacing w:line="360" w:lineRule="auto" w:after="40"/>
+      </w:pPr>
+      <w:r>
+        <w:rPr>
+          <w:b/>
+        </w:rPr>
+        <w:t xml:space="preserve">30. </w:t>
+      </w:r>
+      <w:r>
+        <w:rPr>
+          <w:sz w:val="21"/>
+        </w:rPr>
+        <w:t>E. F. Schumacher, “Buddhist Economics,” in Small Is Beautiful: Economics as if People Mattered (London: Blond &amp; Briggs, 1973), 50–58.</w:t>
+      </w:r>
+    </w:p>
+    <w:p>
+      <w:pPr>
+        <w:spacing w:line="360" w:lineRule="auto" w:after="40"/>
+      </w:pPr>
+      <w:r>
+        <w:rPr>
+          <w:b/>
+        </w:rPr>
+        <w:t xml:space="preserve">31. </w:t>
+      </w:r>
+      <w:r>
+        <w:rPr>
+          <w:sz w:val="21"/>
+        </w:rPr>
+        <w:t>M. K. Gandhi, Non-Violent Resistance (Satyagraha) (New York: Schocken, 1961); on craving (taṇhā) as the root to be extinguished, Walpola Rahula, What the Buddha Taught, 2nd ed. (New York: Grove Press, 1974), 29–44.</w:t>
+      </w:r>
+    </w:p>
+    <w:p>
+      <w:pPr>
+        <w:spacing w:line="360" w:lineRule="auto" w:after="40"/>
+      </w:pPr>
+      <w:r>
+        <w:rPr>
+          <w:b/>
+        </w:rPr>
+        <w:t xml:space="preserve">32. </w:t>
+      </w:r>
+      <w:r>
+        <w:rPr>
+          <w:sz w:val="21"/>
+        </w:rPr>
         <w:t>Hans Jonas, The Imperative of Responsibility: In Search of an Ethics for the Technological Age, trans. Hans Jonas with David Herr (Chicago: University of Chicago Press, 1984).</w:t>
+      </w:r>
+    </w:p>
+    <w:p>
+      <w:pPr>
+        <w:spacing w:line="360" w:lineRule="auto" w:after="40"/>
+      </w:pPr>
+      <w:r>
+        <w:rPr>
+          <w:b/>
+        </w:rPr>
+        <w:t xml:space="preserve">33. </w:t>
+      </w:r>
+      <w:r>
+        <w:rPr>
+          <w:sz w:val="21"/>
+        </w:rPr>
+        <w:t>Joseph S. Nye Jr., Nuclear Ethics (New York: Free Press, 1986), esp. chaps. 1 and 5.</w:t>
       </w:r>
     </w:p>
     <w:sectPr>

</xml_diff>